<commit_message>
Rebrand: Dungan Soft Technologies -> DunganSoft Technologies (all files)
Updated 8 files: README.md, SQL schema header, both PHP file headers,
all three .docx documents, and regenerated client preview PDF with
corrected branding and fresh screenshots.
</commit_message>
<xml_diff>
--- a/docs/instant_vehicle_lookup.docx
+++ b/docs/instant_vehicle_lookup.docx
@@ -55,7 +55,7 @@
           <w:bCs/>
           <w:b/>
         </w:rPr>
-        <w:t xml:space="preserve">Dungan Soft Technologies</w:t>
+        <w:t>DunganSoft Technologies</w:t>
       </w:r>
     </w:p>
     <w:p>
@@ -3885,7 +3885,7 @@
           <w:bCs/>
           <w:b/>
         </w:rPr>
-        <w:t xml:space="preserve">Dungan Soft Technologies</w:t>
+        <w:t>DunganSoft Technologies</w:t>
       </w:r>
     </w:p>
     <w:p>
@@ -3992,7 +3992,7 @@
         <w:sz w:val="16"/>
         <w:szCs w:val="16"/>
       </w:rPr>
-      <w:t xml:space="preserve">Dungan Soft Technologies</w:t>
+      <w:t>DunganSoft Technologies</w:t>
     </w:r>
     <w:r>
       <w:rPr>

</xml_diff>